<commit_message>
Guia usuario y cambios web
</commit_message>
<xml_diff>
--- a/docs/guia_usuario.docx
+++ b/docs/guia_usuario.docx
@@ -5,6 +5,7 @@
     <w:p>
       <w:pPr>
         <w:pStyle w:val="Ttulo1"/>
+        <w:jc w:val="both"/>
         <w:rPr>
           <w:sz w:val="36"/>
           <w:szCs w:val="36"/>
@@ -22,6 +23,7 @@
     </w:p>
     <w:p>
       <w:pPr>
+        <w:jc w:val="both"/>
         <w:rPr>
           <w:lang w:val="es-ES"/>
         </w:rPr>
@@ -29,54 +31,85 @@
     </w:p>
     <w:p>
       <w:pPr>
-        <w:rPr>
-          <w:u w:val="single"/>
-          <w:lang w:val="es-ES"/>
-        </w:rPr>
-      </w:pPr>
-      <w:r>
-        <w:rPr>
-          <w:lang w:val="es-ES"/>
-        </w:rPr>
-        <w:t>Este documento está pensado para personas sin conocimientos técnicos que quieren usar la aplicación de forma sencilla.</w:t>
+        <w:pStyle w:val="Ttulo2"/>
+        <w:jc w:val="both"/>
+        <w:rPr>
+          <w:lang w:val="es-ES"/>
+        </w:rPr>
+      </w:pPr>
+      <w:r>
+        <w:rPr>
+          <w:lang w:val="es-ES"/>
+        </w:rPr>
+        <w:t>1. Descargar la aplicación</w:t>
       </w:r>
     </w:p>
     <w:p>
       <w:pPr>
-        <w:rPr>
-          <w:lang w:val="es-ES"/>
-        </w:rPr>
-      </w:pPr>
-      <w:r>
-        <w:rPr>
-          <w:lang w:val="es-ES"/>
-        </w:rPr>
-        <w:t>----------------------------------------</w:t>
+        <w:jc w:val="both"/>
+        <w:rPr>
+          <w:lang w:val="es-ES"/>
+        </w:rPr>
+      </w:pPr>
+      <w:r>
+        <w:rPr>
+          <w:lang w:val="es-ES"/>
+        </w:rPr>
+        <w:t>Descarga la versión de Windows, Android o Linux desde el enlace de distribución</w:t>
+      </w:r>
+      <w:r>
+        <w:rPr>
+          <w:lang w:val="es-ES"/>
+        </w:rPr>
+        <w:t xml:space="preserve"> de la página </w:t>
+      </w:r>
+      <w:hyperlink r:id="rId6" w:history="1">
+        <w:r>
+          <w:rPr>
+            <w:rStyle w:val="Hipervnculo"/>
+            <w:lang w:val="es-ES"/>
+          </w:rPr>
+          <w:t>web</w:t>
+        </w:r>
+      </w:hyperlink>
+      <w:r>
+        <w:rPr>
+          <w:lang w:val="es-ES"/>
+        </w:rPr>
+        <w:t>.</w:t>
       </w:r>
     </w:p>
     <w:p>
       <w:pPr>
-        <w:rPr>
-          <w:lang w:val="es-ES"/>
-        </w:rPr>
-      </w:pPr>
+        <w:jc w:val="both"/>
+        <w:rPr>
+          <w:lang w:val="es-ES"/>
+        </w:rPr>
+      </w:pPr>
+      <w:r>
+        <w:rPr>
+          <w:lang w:val="es-ES"/>
+        </w:rPr>
+        <w:t>En el caso de Windows, el archivo final será un `.exe` que podrás abrir con doble clic.</w:t>
+      </w:r>
     </w:p>
     <w:p>
       <w:pPr>
-        <w:pStyle w:val="Ttulo2"/>
-        <w:rPr>
-          <w:lang w:val="es-ES"/>
-        </w:rPr>
-      </w:pPr>
-      <w:r>
-        <w:rPr>
-          <w:lang w:val="es-ES"/>
-        </w:rPr>
-        <w:t>1. Descargar la aplicación</w:t>
+        <w:jc w:val="both"/>
+        <w:rPr>
+          <w:lang w:val="es-ES"/>
+        </w:rPr>
+      </w:pPr>
+      <w:r>
+        <w:rPr>
+          <w:lang w:val="es-ES"/>
+        </w:rPr>
+        <w:t xml:space="preserve">[Imagen: Pantalla de descarga] </w:t>
       </w:r>
     </w:p>
     <w:p>
       <w:pPr>
+        <w:jc w:val="both"/>
         <w:rPr>
           <w:lang w:val="es-ES"/>
         </w:rPr>
@@ -84,58 +117,206 @@
     </w:p>
     <w:p>
       <w:pPr>
-        <w:rPr>
-          <w:lang w:val="es-ES"/>
-        </w:rPr>
-      </w:pPr>
-      <w:r>
-        <w:rPr>
-          <w:lang w:val="es-ES"/>
-        </w:rPr>
-        <w:t>Descarga la versión de Windows, Android o Linux desde el enlace de distribución.</w:t>
+        <w:pStyle w:val="Ttulo2"/>
+        <w:jc w:val="both"/>
+        <w:rPr>
+          <w:lang w:val="es-ES"/>
+        </w:rPr>
+      </w:pPr>
+      <w:r>
+        <w:rPr>
+          <w:lang w:val="es-ES"/>
+        </w:rPr>
+        <w:t>2. Instalar la aplicación</w:t>
       </w:r>
     </w:p>
     <w:p>
       <w:pPr>
-        <w:rPr>
-          <w:lang w:val="es-ES"/>
-        </w:rPr>
-      </w:pPr>
-      <w:r>
-        <w:rPr>
-          <w:lang w:val="es-ES"/>
-        </w:rPr>
-        <w:t>En el caso de Windows, el archivo final será un `.exe` que podrás abrir con doble clic.</w:t>
+        <w:jc w:val="both"/>
+        <w:rPr>
+          <w:lang w:val="es-ES"/>
+        </w:rPr>
+      </w:pPr>
+      <w:r>
+        <w:rPr>
+          <w:lang w:val="es-ES"/>
+        </w:rPr>
+        <w:t xml:space="preserve">En </w:t>
+      </w:r>
+      <w:r>
+        <w:rPr>
+          <w:b/>
+          <w:bCs/>
+          <w:lang w:val="es-ES"/>
+        </w:rPr>
+        <w:t>Android</w:t>
+      </w:r>
+      <w:r>
+        <w:rPr>
+          <w:lang w:val="es-ES"/>
+        </w:rPr>
+        <w:t xml:space="preserve"> se descarga directamente la </w:t>
+      </w:r>
+      <w:proofErr w:type="spellStart"/>
+      <w:r>
+        <w:rPr>
+          <w:lang w:val="es-ES"/>
+        </w:rPr>
+        <w:t>apk</w:t>
+      </w:r>
+      <w:proofErr w:type="spellEnd"/>
+      <w:r>
+        <w:rPr>
+          <w:lang w:val="es-ES"/>
+        </w:rPr>
+        <w:t xml:space="preserve">. Busca el archivo descargado, haz </w:t>
+      </w:r>
+      <w:proofErr w:type="spellStart"/>
+      <w:r>
+        <w:rPr>
+          <w:lang w:val="es-ES"/>
+        </w:rPr>
+        <w:t>click</w:t>
+      </w:r>
+      <w:proofErr w:type="spellEnd"/>
+      <w:r>
+        <w:rPr>
+          <w:lang w:val="es-ES"/>
+        </w:rPr>
+        <w:t xml:space="preserve"> en él y se te instalará la app. Puede que tengas que activar la configuración de instalar desde origen externo.</w:t>
       </w:r>
     </w:p>
     <w:p>
       <w:pPr>
-        <w:rPr>
-          <w:lang w:val="es-ES"/>
-        </w:rPr>
-      </w:pPr>
-      <w:r>
-        <w:rPr>
-          <w:lang w:val="es-ES"/>
-        </w:rPr>
-        <w:t xml:space="preserve">[Imagen: Pantalla de descarga] </w:t>
+        <w:jc w:val="both"/>
+        <w:rPr>
+          <w:lang w:val="es-ES"/>
+        </w:rPr>
+      </w:pPr>
+      <w:r>
+        <w:rPr>
+          <w:lang w:val="es-ES"/>
+        </w:rPr>
+        <w:t xml:space="preserve">En </w:t>
+      </w:r>
+      <w:r>
+        <w:rPr>
+          <w:b/>
+          <w:bCs/>
+          <w:lang w:val="es-ES"/>
+        </w:rPr>
+        <w:t>Windows</w:t>
+      </w:r>
+      <w:r>
+        <w:rPr>
+          <w:lang w:val="es-ES"/>
+        </w:rPr>
+        <w:t xml:space="preserve"> se descarga un archivo .zip. Tendrás que extraer todo en la carpeta que desees y luego ejecutar el archivo PlantAID.exe en la carpeta extraída. </w:t>
       </w:r>
     </w:p>
     <w:p>
       <w:pPr>
-        <w:rPr>
-          <w:lang w:val="es-ES"/>
-        </w:rPr>
-      </w:pPr>
-      <w:r>
-        <w:rPr>
-          <w:lang w:val="es-ES"/>
-        </w:rPr>
-        <w:t>----------------------------------------</w:t>
+        <w:jc w:val="both"/>
+        <w:rPr>
+          <w:lang w:val="es-ES"/>
+        </w:rPr>
+      </w:pPr>
+      <w:r>
+        <w:rPr>
+          <w:lang w:val="es-ES"/>
+        </w:rPr>
+        <w:t xml:space="preserve">En </w:t>
+      </w:r>
+      <w:r>
+        <w:rPr>
+          <w:b/>
+          <w:bCs/>
+          <w:lang w:val="es-ES"/>
+        </w:rPr>
+        <w:t>Linux</w:t>
+      </w:r>
+      <w:r>
+        <w:rPr>
+          <w:lang w:val="es-ES"/>
+        </w:rPr>
+        <w:t xml:space="preserve"> se descarga un archivo .</w:t>
+      </w:r>
+      <w:proofErr w:type="spellStart"/>
+      <w:r>
+        <w:rPr>
+          <w:lang w:val="es-ES"/>
+        </w:rPr>
+        <w:t>deb</w:t>
+      </w:r>
+      <w:proofErr w:type="spellEnd"/>
+      <w:r>
+        <w:rPr>
+          <w:lang w:val="es-ES"/>
+        </w:rPr>
+        <w:t xml:space="preserve">. Solo tendrás que hacer </w:t>
+      </w:r>
+      <w:proofErr w:type="spellStart"/>
+      <w:r>
+        <w:rPr>
+          <w:lang w:val="es-ES"/>
+        </w:rPr>
+        <w:t>click</w:t>
+      </w:r>
+      <w:proofErr w:type="spellEnd"/>
+      <w:r>
+        <w:rPr>
+          <w:lang w:val="es-ES"/>
+        </w:rPr>
+        <w:t xml:space="preserve"> en ese archivo, darle a instalar y </w:t>
+      </w:r>
+      <w:r>
+        <w:rPr>
+          <w:lang w:val="es-ES"/>
+        </w:rPr>
+        <w:t>a</w:t>
+      </w:r>
+      <w:r>
+        <w:rPr>
+          <w:lang w:val="es-ES"/>
+        </w:rPr>
+        <w:t>brir Plant-</w:t>
+      </w:r>
+      <w:proofErr w:type="spellStart"/>
+      <w:r>
+        <w:rPr>
+          <w:lang w:val="es-ES"/>
+        </w:rPr>
+        <w:t>AId</w:t>
+      </w:r>
+      <w:proofErr w:type="spellEnd"/>
+      <w:r>
+        <w:rPr>
+          <w:lang w:val="es-ES"/>
+        </w:rPr>
+        <w:t xml:space="preserve"> desde el men</w:t>
+      </w:r>
+      <w:r>
+        <w:rPr>
+          <w:lang w:val="es-ES"/>
+        </w:rPr>
+        <w:t>ú</w:t>
+      </w:r>
+      <w:r>
+        <w:rPr>
+          <w:lang w:val="es-ES"/>
+        </w:rPr>
+        <w:t xml:space="preserve"> de aplicaciones</w:t>
+      </w:r>
+      <w:r>
+        <w:rPr>
+          <w:lang w:val="es-ES"/>
+        </w:rPr>
+        <w:t>.</w:t>
       </w:r>
     </w:p>
     <w:p>
       <w:pPr>
+        <w:jc w:val="both"/>
         <w:rPr>
           <w:lang w:val="es-ES"/>
         </w:rPr>
@@ -143,66 +324,142 @@
     </w:p>
     <w:p>
       <w:pPr>
-        <w:pStyle w:val="Ttulo2"/>
-        <w:rPr>
-          <w:lang w:val="es-ES"/>
-        </w:rPr>
-      </w:pPr>
-      <w:r>
-        <w:rPr>
-          <w:lang w:val="es-ES"/>
-        </w:rPr>
-        <w:t>2. Instalar la aplicación</w:t>
+        <w:jc w:val="both"/>
+        <w:rPr>
+          <w:lang w:val="es-ES"/>
+        </w:rPr>
+      </w:pPr>
+      <w:r>
+        <w:rPr>
+          <w:lang w:val="es-ES"/>
+        </w:rPr>
+        <w:t>La aplicación se conecta al servidor de la universidad, así que solo necesita que la URL de la API esté configurada correctamente.</w:t>
       </w:r>
     </w:p>
     <w:p>
       <w:pPr>
-        <w:rPr>
-          <w:lang w:val="es-ES"/>
-        </w:rPr>
-      </w:pPr>
+        <w:jc w:val="both"/>
+        <w:rPr>
+          <w:lang w:val="es-ES"/>
+        </w:rPr>
+      </w:pPr>
+      <w:r>
+        <w:rPr>
+          <w:b/>
+          <w:bCs/>
+          <w:lang w:val="es-ES"/>
+        </w:rPr>
+        <w:t>URL de la API</w:t>
+      </w:r>
+      <w:r>
+        <w:rPr>
+          <w:lang w:val="es-ES"/>
+        </w:rPr>
+        <w:t xml:space="preserve">: </w:t>
+      </w:r>
+      <w:r>
+        <w:rPr>
+          <w:lang w:val="es-ES"/>
+        </w:rPr>
+        <w:t>plantas.gti-ia.upv.es</w:t>
+      </w:r>
     </w:p>
     <w:p>
       <w:pPr>
-        <w:rPr>
-          <w:lang w:val="es-ES"/>
-        </w:rPr>
-      </w:pPr>
-      <w:r>
-        <w:rPr>
-          <w:lang w:val="es-ES"/>
-        </w:rPr>
-        <w:t>Si te entregan un instalador, ejecútalo y sigue el asistente.</w:t>
-      </w:r>
+        <w:jc w:val="both"/>
+        <w:rPr>
+          <w:lang w:val="es-ES"/>
+        </w:rPr>
+      </w:pPr>
     </w:p>
     <w:p>
       <w:pPr>
-        <w:rPr>
-          <w:lang w:val="es-ES"/>
-        </w:rPr>
-      </w:pPr>
-      <w:r>
-        <w:rPr>
-          <w:lang w:val="es-ES"/>
-        </w:rPr>
-        <w:t>Si te entregan una carpeta portable, entra dentro y abre `Plant-AId.exe`.</w:t>
+        <w:jc w:val="both"/>
+        <w:rPr>
+          <w:lang w:val="es-ES"/>
+        </w:rPr>
+      </w:pPr>
+      <w:r>
+        <w:rPr>
+          <w:lang w:val="es-ES"/>
+        </w:rPr>
+        <w:t xml:space="preserve">[Imagen: Pantalla de instalación] </w:t>
       </w:r>
     </w:p>
     <w:p>
       <w:pPr>
-        <w:rPr>
-          <w:lang w:val="es-ES"/>
-        </w:rPr>
-      </w:pPr>
-      <w:r>
-        <w:rPr>
-          <w:lang w:val="es-ES"/>
-        </w:rPr>
-        <w:t>La aplicación se conecta al servidor de la universidad, así que solo necesita que la URL de la API esté configurada correctamente.</w:t>
-      </w:r>
+        <w:jc w:val="both"/>
+        <w:rPr>
+          <w:lang w:val="es-ES"/>
+        </w:rPr>
+      </w:pPr>
     </w:p>
     <w:p>
       <w:pPr>
+        <w:jc w:val="both"/>
+        <w:rPr>
+          <w:lang w:val="es-ES"/>
+        </w:rPr>
+      </w:pPr>
+    </w:p>
+    <w:p>
+      <w:pPr>
+        <w:jc w:val="both"/>
+        <w:rPr>
+          <w:lang w:val="es-ES"/>
+        </w:rPr>
+      </w:pPr>
+    </w:p>
+    <w:p>
+      <w:pPr>
+        <w:jc w:val="both"/>
+        <w:rPr>
+          <w:lang w:val="es-ES"/>
+        </w:rPr>
+      </w:pPr>
+    </w:p>
+    <w:p>
+      <w:pPr>
+        <w:pStyle w:val="Ttulo2"/>
+        <w:jc w:val="both"/>
+        <w:rPr>
+          <w:lang w:val="es-ES"/>
+        </w:rPr>
+      </w:pPr>
+      <w:r>
+        <w:rPr>
+          <w:lang w:val="es-ES"/>
+        </w:rPr>
+        <w:lastRenderedPageBreak/>
+        <w:t>3. Primer uso</w:t>
+      </w:r>
+    </w:p>
+    <w:p>
+      <w:pPr>
+        <w:pStyle w:val="Ttulo3"/>
+        <w:jc w:val="both"/>
+      </w:pPr>
+      <w:r>
+        <w:t xml:space="preserve">3.1. </w:t>
+      </w:r>
+      <w:proofErr w:type="spellStart"/>
+      <w:r>
+        <w:t>Iniciar</w:t>
+      </w:r>
+      <w:proofErr w:type="spellEnd"/>
+      <w:r>
+        <w:t xml:space="preserve"> la </w:t>
+      </w:r>
+      <w:proofErr w:type="spellStart"/>
+      <w:r>
+        <w:t>aplicación</w:t>
+      </w:r>
+      <w:proofErr w:type="spellEnd"/>
+    </w:p>
+    <w:p>
+      <w:pPr>
+        <w:pStyle w:val="Listaconvietas"/>
+        <w:jc w:val="both"/>
         <w:rPr>
           <w:lang w:val="es-ES"/>
         </w:rPr>
@@ -213,142 +470,96 @@
           <w:bCs/>
           <w:lang w:val="es-ES"/>
         </w:rPr>
-        <w:t>URL de la API</w:t>
-      </w:r>
-      <w:r>
-        <w:rPr>
-          <w:lang w:val="es-ES"/>
-        </w:rPr>
-        <w:t xml:space="preserve">: </w:t>
-      </w:r>
-      <w:r>
-        <w:rPr>
-          <w:lang w:val="es-ES"/>
-        </w:rPr>
-        <w:t>plantas.gti-ia.upv.es</w:t>
+        <w:t>Android</w:t>
+      </w:r>
+      <w:r>
+        <w:rPr>
+          <w:lang w:val="es-ES"/>
+        </w:rPr>
+        <w:t>: abre `Aplicaciones` y busca `</w:t>
+      </w:r>
+      <w:proofErr w:type="spellStart"/>
+      <w:r>
+        <w:rPr>
+          <w:lang w:val="es-ES"/>
+        </w:rPr>
+        <w:t>PlantAid</w:t>
+      </w:r>
+      <w:proofErr w:type="spellEnd"/>
+      <w:r>
+        <w:rPr>
+          <w:lang w:val="es-ES"/>
+        </w:rPr>
+        <w:t>`.</w:t>
       </w:r>
     </w:p>
     <w:p>
       <w:pPr>
-        <w:rPr>
-          <w:lang w:val="es-ES"/>
-        </w:rPr>
-      </w:pPr>
+        <w:pStyle w:val="Listaconvietas"/>
+        <w:jc w:val="both"/>
+        <w:rPr>
+          <w:lang w:val="es-ES"/>
+        </w:rPr>
+      </w:pPr>
+      <w:r>
+        <w:rPr>
+          <w:b/>
+          <w:bCs/>
+          <w:lang w:val="es-ES"/>
+        </w:rPr>
+        <w:t>Windows</w:t>
+      </w:r>
+      <w:r>
+        <w:rPr>
+          <w:lang w:val="es-ES"/>
+        </w:rPr>
+        <w:t>: haz doble clic en el icono del escritorio Plant-Aid.exe.</w:t>
+      </w:r>
     </w:p>
     <w:p>
       <w:pPr>
-        <w:rPr>
-          <w:lang w:val="es-ES"/>
-        </w:rPr>
-      </w:pPr>
-      <w:r>
-        <w:rPr>
-          <w:lang w:val="es-ES"/>
-        </w:rPr>
-        <w:t xml:space="preserve">[Imagen: Pantalla de instalación] </w:t>
+        <w:pStyle w:val="Listaconvietas"/>
+        <w:jc w:val="both"/>
+        <w:rPr>
+          <w:lang w:val="es-ES"/>
+        </w:rPr>
+      </w:pPr>
+      <w:r>
+        <w:rPr>
+          <w:b/>
+          <w:bCs/>
+          <w:lang w:val="es-ES"/>
+        </w:rPr>
+        <w:t>Linux</w:t>
+      </w:r>
+      <w:r>
+        <w:rPr>
+          <w:lang w:val="es-ES"/>
+        </w:rPr>
+        <w:t xml:space="preserve">: Busca Plant-Aid </w:t>
+      </w:r>
+      <w:r>
+        <w:rPr>
+          <w:lang w:val="es-ES"/>
+        </w:rPr>
+        <w:t>en</w:t>
+      </w:r>
+      <w:r>
+        <w:rPr>
+          <w:lang w:val="es-ES"/>
+        </w:rPr>
+        <w:t xml:space="preserve"> e</w:t>
+      </w:r>
+      <w:r>
+        <w:rPr>
+          <w:lang w:val="es-ES"/>
+        </w:rPr>
+        <w:t>l menú de aplicaciones y ejecútalo.</w:t>
       </w:r>
     </w:p>
     <w:p>
       <w:pPr>
-        <w:rPr>
-          <w:lang w:val="es-ES"/>
-        </w:rPr>
-      </w:pPr>
-    </w:p>
-    <w:p>
-      <w:pPr>
-        <w:rPr>
-          <w:lang w:val="es-ES"/>
-        </w:rPr>
-      </w:pPr>
-      <w:r>
-        <w:rPr>
-          <w:lang w:val="es-ES"/>
-        </w:rPr>
-        <w:t>----------------------------------------</w:t>
-      </w:r>
-    </w:p>
-    <w:p>
-      <w:pPr>
-        <w:rPr>
-          <w:lang w:val="es-ES"/>
-        </w:rPr>
-      </w:pPr>
-    </w:p>
-    <w:p>
-      <w:pPr>
-        <w:rPr>
-          <w:lang w:val="es-ES"/>
-        </w:rPr>
-      </w:pPr>
-    </w:p>
-    <w:p>
-      <w:pPr>
-        <w:pStyle w:val="Ttulo2"/>
-        <w:rPr>
-          <w:lang w:val="es-ES"/>
-        </w:rPr>
-      </w:pPr>
-      <w:r>
-        <w:rPr>
-          <w:lang w:val="es-ES"/>
-        </w:rPr>
-        <w:lastRenderedPageBreak/>
-        <w:t>3. Primer uso</w:t>
-      </w:r>
-    </w:p>
-    <w:p>
-      <w:pPr>
-        <w:pStyle w:val="Ttulo3"/>
-      </w:pPr>
-      <w:r>
-        <w:t>3.1. Iniciar la aplicación</w:t>
-      </w:r>
-    </w:p>
-    <w:p/>
-    <w:p>
-      <w:pPr>
-        <w:pStyle w:val="Listaconvietas"/>
-        <w:rPr>
-          <w:lang w:val="es-ES"/>
-        </w:rPr>
-      </w:pPr>
-      <w:r>
-        <w:rPr>
-          <w:lang w:val="es-ES"/>
-        </w:rPr>
-        <w:t>**Windows**: haz doble clic en el icono del escritorio.</w:t>
-      </w:r>
-    </w:p>
-    <w:p>
-      <w:pPr>
-        <w:pStyle w:val="Listaconvietas"/>
-        <w:rPr>
-          <w:lang w:val="es-ES"/>
-        </w:rPr>
-      </w:pPr>
-      <w:r>
-        <w:rPr>
-          <w:lang w:val="es-ES"/>
-        </w:rPr>
-        <w:t>**Android**: abre `Aplicaciones` y busca `PlantAid`.</w:t>
-      </w:r>
-    </w:p>
-    <w:p>
-      <w:pPr>
-        <w:rPr>
-          <w:lang w:val="es-ES"/>
-        </w:rPr>
-      </w:pPr>
-      <w:r>
-        <w:rPr>
-          <w:lang w:val="es-ES"/>
-        </w:rPr>
-        <w:t>En Windows no hace falta abrir Python ni una terminal. La aplicación se abre como cualquier programa instalado.</w:t>
-      </w:r>
-    </w:p>
-    <w:p>
-      <w:pPr>
+        <w:jc w:val="both"/>
         <w:rPr>
           <w:lang w:val="es-ES"/>
         </w:rPr>
@@ -359,9 +570,9 @@
           <w:lang w:val="es-ES"/>
         </w:rPr>
         <w:drawing>
-          <wp:inline distT="0" distB="0" distL="0" distR="0" wp14:anchorId="11F32C11" wp14:editId="6E3A6411">
-            <wp:extent cx="1463040" cy="1463040"/>
-            <wp:effectExtent l="0" t="0" r="3810" b="3810"/>
+          <wp:inline distT="0" distB="0" distL="0" distR="0" wp14:anchorId="11F32C11" wp14:editId="5EFEBA18">
+            <wp:extent cx="1341120" cy="1341120"/>
+            <wp:effectExtent l="0" t="0" r="0" b="0"/>
             <wp:docPr id="152404545" name="Imagen 2"/>
             <wp:cNvGraphicFramePr>
               <a:graphicFrameLocks xmlns:a="http://schemas.openxmlformats.org/drawingml/2006/main" noChangeAspect="1"/>
@@ -374,7 +585,7 @@
                     <pic:cNvPicPr/>
                   </pic:nvPicPr>
                   <pic:blipFill>
-                    <a:blip r:embed="rId6"/>
+                    <a:blip r:embed="rId7"/>
                     <a:stretch>
                       <a:fillRect/>
                     </a:stretch>
@@ -382,7 +593,7 @@
                   <pic:spPr>
                     <a:xfrm>
                       <a:off x="0" y="0"/>
-                      <a:ext cx="1463040" cy="1463040"/>
+                      <a:ext cx="1341120" cy="1341120"/>
                     </a:xfrm>
                     <a:prstGeom prst="rect">
                       <a:avLst/>
@@ -397,6 +608,7 @@
     </w:p>
     <w:p>
       <w:pPr>
+        <w:jc w:val="both"/>
         <w:rPr>
           <w:lang w:val="es-ES"/>
         </w:rPr>
@@ -422,6 +634,7 @@
     </w:p>
     <w:p>
       <w:pPr>
+        <w:jc w:val="both"/>
         <w:rPr>
           <w:lang w:val="es-ES"/>
         </w:rPr>
@@ -430,6 +643,7 @@
     <w:p>
       <w:pPr>
         <w:pStyle w:val="Ttulo3"/>
+        <w:jc w:val="both"/>
         <w:rPr>
           <w:lang w:val="es-ES"/>
         </w:rPr>
@@ -443,66 +657,63 @@
     </w:p>
     <w:p>
       <w:pPr>
-        <w:rPr>
-          <w:lang w:val="es-ES"/>
-        </w:rPr>
-      </w:pPr>
+        <w:jc w:val="both"/>
+        <w:rPr>
+          <w:lang w:val="es-ES"/>
+        </w:rPr>
+      </w:pPr>
+      <w:r>
+        <w:rPr>
+          <w:lang w:val="es-ES"/>
+        </w:rPr>
+        <w:t>Si no tienes una cuenta todavía, regístrate y se te dará el rol de Usuario. Si quieres otro rol, contacta con el desarrollador.</w:t>
+      </w:r>
     </w:p>
     <w:p>
       <w:pPr>
-        <w:rPr>
-          <w:lang w:val="es-ES"/>
-        </w:rPr>
-      </w:pPr>
-      <w:r>
-        <w:rPr>
-          <w:lang w:val="es-ES"/>
-        </w:rPr>
-        <w:t>Si no tienes una cuenta todavía, regístrate y se te dará el rol de Usuario. Si quieres otro rol, contacta con el desarrollador.</w:t>
+        <w:jc w:val="both"/>
+        <w:rPr>
+          <w:lang w:val="es-ES"/>
+        </w:rPr>
+      </w:pPr>
+      <w:r>
+        <w:rPr>
+          <w:lang w:val="es-ES"/>
+        </w:rPr>
+        <w:t>Una vez tengas tu cuenta, selecciona tu rol e inicia sesión con tus credenciales.</w:t>
       </w:r>
     </w:p>
     <w:p>
       <w:pPr>
-        <w:rPr>
-          <w:lang w:val="es-ES"/>
-        </w:rPr>
-      </w:pPr>
-      <w:r>
-        <w:rPr>
-          <w:lang w:val="es-ES"/>
-        </w:rPr>
-        <w:t>Una vez tengas tu cuenta, selecciona tu rol e inicia sesión con tus credenciales.</w:t>
+        <w:jc w:val="both"/>
+        <w:rPr>
+          <w:lang w:val="es-ES"/>
+        </w:rPr>
+      </w:pPr>
+      <w:r>
+        <w:rPr>
+          <w:lang w:val="es-ES"/>
+        </w:rPr>
+        <w:t xml:space="preserve">Si te da error de conexión, asegúrate de que la dirección a la que te estás conectando es la correcta en </w:t>
+      </w:r>
+      <w:r>
+        <w:rPr>
+          <w:b/>
+          <w:bCs/>
+          <w:lang w:val="es-ES"/>
+        </w:rPr>
+        <w:t>Configuración de conexión</w:t>
+      </w:r>
+      <w:r>
+        <w:rPr>
+          <w:lang w:val="es-ES"/>
+        </w:rPr>
+        <w:t>.</w:t>
       </w:r>
     </w:p>
     <w:p>
       <w:pPr>
-        <w:rPr>
-          <w:lang w:val="es-ES"/>
-        </w:rPr>
-      </w:pPr>
-      <w:r>
-        <w:rPr>
-          <w:lang w:val="es-ES"/>
-        </w:rPr>
-        <w:t xml:space="preserve">Si te da error de conexión, asegúrate de que la dirección a la que te estás conectando es la correcta en </w:t>
-      </w:r>
-      <w:r>
-        <w:rPr>
-          <w:b/>
-          <w:bCs/>
-          <w:lang w:val="es-ES"/>
-        </w:rPr>
-        <w:t>Configuración de conexión</w:t>
-      </w:r>
-      <w:r>
-        <w:rPr>
-          <w:lang w:val="es-ES"/>
-        </w:rPr>
-        <w:t>.</w:t>
-      </w:r>
-    </w:p>
-    <w:p>
-      <w:pPr>
+        <w:jc w:val="both"/>
         <w:rPr>
           <w:lang w:val="es-ES"/>
         </w:rPr>
@@ -512,7 +723,6 @@
           <w:noProof/>
           <w:lang w:val="es-ES"/>
         </w:rPr>
-        <w:lastRenderedPageBreak/>
         <w:drawing>
           <wp:inline distT="0" distB="0" distL="0" distR="0" wp14:anchorId="13429EFC" wp14:editId="1A48A36D">
             <wp:extent cx="5382525" cy="2895600"/>
@@ -529,7 +739,7 @@
                     <pic:cNvPicPr/>
                   </pic:nvPicPr>
                   <pic:blipFill>
-                    <a:blip r:embed="rId7"/>
+                    <a:blip r:embed="rId8"/>
                     <a:stretch>
                       <a:fillRect/>
                     </a:stretch>
@@ -552,6 +762,7 @@
     </w:p>
     <w:p>
       <w:pPr>
+        <w:jc w:val="both"/>
         <w:rPr>
           <w:lang w:val="es-ES"/>
         </w:rPr>
@@ -565,157 +776,145 @@
     </w:p>
     <w:p>
       <w:pPr>
-        <w:rPr>
-          <w:lang w:val="es-ES"/>
-        </w:rPr>
-      </w:pPr>
-      <w:r>
-        <w:rPr>
-          <w:lang w:val="es-ES"/>
-        </w:rPr>
-        <w:t>----------------------------------------</w:t>
+        <w:pStyle w:val="Ttulo2"/>
+        <w:jc w:val="both"/>
+        <w:rPr>
+          <w:lang w:val="es-ES"/>
+        </w:rPr>
+      </w:pPr>
+      <w:r>
+        <w:rPr>
+          <w:lang w:val="es-ES"/>
+        </w:rPr>
+        <w:lastRenderedPageBreak/>
+        <w:t>4. Funciones principales para usuarios</w:t>
       </w:r>
     </w:p>
     <w:p>
       <w:pPr>
-        <w:rPr>
-          <w:lang w:val="es-ES"/>
-        </w:rPr>
-      </w:pPr>
+        <w:pStyle w:val="Ttulo3"/>
+        <w:jc w:val="both"/>
+        <w:rPr>
+          <w:lang w:val="es-ES"/>
+        </w:rPr>
+      </w:pPr>
+      <w:r>
+        <w:rPr>
+          <w:lang w:val="es-ES"/>
+        </w:rPr>
+        <w:t>4.1. Subir imágenes</w:t>
+      </w:r>
     </w:p>
     <w:p>
       <w:pPr>
-        <w:pStyle w:val="Ttulo2"/>
-        <w:rPr>
-          <w:lang w:val="es-ES"/>
-        </w:rPr>
-      </w:pPr>
-      <w:r>
-        <w:rPr>
-          <w:lang w:val="es-ES"/>
-        </w:rPr>
-        <w:t>4. Funciones principales para usuarios</w:t>
+        <w:pStyle w:val="Listaconvietas"/>
+        <w:jc w:val="both"/>
+        <w:rPr>
+          <w:lang w:val="es-ES"/>
+        </w:rPr>
+      </w:pPr>
+      <w:r>
+        <w:rPr>
+          <w:lang w:val="es-ES"/>
+        </w:rPr>
+        <w:t xml:space="preserve">Pulsa el botón </w:t>
+      </w:r>
+      <w:r>
+        <w:rPr>
+          <w:b/>
+          <w:bCs/>
+          <w:lang w:val="es-ES"/>
+        </w:rPr>
+        <w:t>Subir Foto</w:t>
+      </w:r>
+      <w:r>
+        <w:rPr>
+          <w:lang w:val="es-ES"/>
+        </w:rPr>
+        <w:t>.</w:t>
       </w:r>
     </w:p>
     <w:p>
       <w:pPr>
-        <w:pStyle w:val="Ttulo3"/>
-        <w:rPr>
-          <w:lang w:val="es-ES"/>
-        </w:rPr>
-      </w:pPr>
-      <w:r>
-        <w:rPr>
-          <w:lang w:val="es-ES"/>
-        </w:rPr>
-        <w:t>4.1. Subir imágenes</w:t>
+        <w:pStyle w:val="Listaconvietas"/>
+        <w:jc w:val="both"/>
+        <w:rPr>
+          <w:lang w:val="es-ES"/>
+        </w:rPr>
+      </w:pPr>
+      <w:r>
+        <w:rPr>
+          <w:lang w:val="es-ES"/>
+        </w:rPr>
+        <w:t>Selecciona una imagen de una hoja</w:t>
+      </w:r>
+      <w:r>
+        <w:rPr>
+          <w:lang w:val="es-ES"/>
+        </w:rPr>
+        <w:t xml:space="preserve">, desde móvil tienes que tener la imagen </w:t>
       </w:r>
     </w:p>
     <w:p>
       <w:pPr>
-        <w:rPr>
-          <w:lang w:val="es-ES"/>
-        </w:rPr>
-      </w:pPr>
+        <w:pStyle w:val="Listaconvietas"/>
+        <w:jc w:val="both"/>
+        <w:rPr>
+          <w:lang w:val="es-ES"/>
+        </w:rPr>
+      </w:pPr>
+      <w:r>
+        <w:rPr>
+          <w:lang w:val="es-ES"/>
+        </w:rPr>
+        <w:t>Elige la etiqueta de tu imagen si la conoces.</w:t>
+      </w:r>
     </w:p>
     <w:p>
       <w:pPr>
         <w:pStyle w:val="Listaconvietas"/>
-        <w:rPr>
-          <w:lang w:val="es-ES"/>
-        </w:rPr>
-      </w:pPr>
-      <w:r>
-        <w:rPr>
-          <w:lang w:val="es-ES"/>
-        </w:rPr>
-        <w:t xml:space="preserve">Pulsa el botón </w:t>
-      </w:r>
-      <w:r>
-        <w:rPr>
-          <w:b/>
-          <w:bCs/>
-          <w:lang w:val="es-ES"/>
-        </w:rPr>
-        <w:t>Subir Foto</w:t>
-      </w:r>
-      <w:r>
-        <w:rPr>
-          <w:lang w:val="es-ES"/>
-        </w:rPr>
-        <w:t>.</w:t>
+        <w:jc w:val="both"/>
+        <w:rPr>
+          <w:lang w:val="es-ES"/>
+        </w:rPr>
+      </w:pPr>
+      <w:r>
+        <w:rPr>
+          <w:lang w:val="es-ES"/>
+        </w:rPr>
+        <w:t>La imagen se añade a la base de datos.</w:t>
       </w:r>
     </w:p>
     <w:p>
       <w:pPr>
         <w:pStyle w:val="Listaconvietas"/>
-        <w:rPr>
-          <w:lang w:val="es-ES"/>
-        </w:rPr>
-      </w:pPr>
-      <w:r>
-        <w:rPr>
-          <w:lang w:val="es-ES"/>
-        </w:rPr>
-        <w:t>Selecciona una imagen de una hoja.</w:t>
+        <w:jc w:val="both"/>
+        <w:rPr>
+          <w:lang w:val="es-ES"/>
+        </w:rPr>
+      </w:pPr>
+      <w:r>
+        <w:rPr>
+          <w:lang w:val="es-ES"/>
+        </w:rPr>
+        <w:t xml:space="preserve">Si está disponible, un modelo puede </w:t>
+      </w:r>
+      <w:r>
+        <w:rPr>
+          <w:lang w:val="es-ES"/>
+        </w:rPr>
+        <w:t>predecir</w:t>
+      </w:r>
+      <w:r>
+        <w:rPr>
+          <w:lang w:val="es-ES"/>
+        </w:rPr>
+        <w:t xml:space="preserve"> la etiqueta de tu imagen.</w:t>
       </w:r>
     </w:p>
     <w:p>
       <w:pPr>
-        <w:pStyle w:val="Listaconvietas"/>
-        <w:rPr>
-          <w:lang w:val="es-ES"/>
-        </w:rPr>
-      </w:pPr>
-      <w:r>
-        <w:rPr>
-          <w:lang w:val="es-ES"/>
-        </w:rPr>
-        <w:t>Elige la etiqueta de tu imagen si la conoces.</w:t>
-      </w:r>
-    </w:p>
-    <w:p>
-      <w:pPr>
-        <w:pStyle w:val="Listaconvietas"/>
-        <w:rPr>
-          <w:lang w:val="es-ES"/>
-        </w:rPr>
-      </w:pPr>
-      <w:r>
-        <w:rPr>
-          <w:lang w:val="es-ES"/>
-        </w:rPr>
-        <w:t>La imagen se añade a la base de datos.</w:t>
-      </w:r>
-    </w:p>
-    <w:p>
-      <w:pPr>
-        <w:pStyle w:val="Listaconvietas"/>
-        <w:rPr>
-          <w:lang w:val="es-ES"/>
-        </w:rPr>
-      </w:pPr>
-      <w:r>
-        <w:rPr>
-          <w:lang w:val="es-ES"/>
-        </w:rPr>
-        <w:t xml:space="preserve">Si está disponible, un modelo puede </w:t>
-      </w:r>
-      <w:r>
-        <w:rPr>
-          <w:lang w:val="es-ES"/>
-        </w:rPr>
-        <w:t>predecir</w:t>
-      </w:r>
-      <w:r>
-        <w:rPr>
-          <w:lang w:val="es-ES"/>
-        </w:rPr>
-        <w:t xml:space="preserve"> la etiqueta de tu imagen.</w:t>
-      </w:r>
-    </w:p>
-    <w:p>
-      <w:pPr>
+        <w:jc w:val="both"/>
         <w:rPr>
           <w:lang w:val="es-ES"/>
         </w:rPr>
@@ -725,7 +924,6 @@
           <w:noProof/>
           <w:lang w:val="es-ES"/>
         </w:rPr>
-        <w:lastRenderedPageBreak/>
         <w:drawing>
           <wp:inline distT="0" distB="0" distL="0" distR="0" wp14:anchorId="3BF2CEC9" wp14:editId="3DFFD234">
             <wp:extent cx="5486400" cy="2942590"/>
@@ -742,7 +940,7 @@
                     <pic:cNvPicPr/>
                   </pic:nvPicPr>
                   <pic:blipFill>
-                    <a:blip r:embed="rId8"/>
+                    <a:blip r:embed="rId9"/>
                     <a:stretch>
                       <a:fillRect/>
                     </a:stretch>
@@ -771,6 +969,7 @@
     </w:p>
     <w:p>
       <w:pPr>
+        <w:jc w:val="both"/>
         <w:rPr>
           <w:lang w:val="es-ES"/>
         </w:rPr>
@@ -779,19 +978,47 @@
     <w:p>
       <w:pPr>
         <w:pStyle w:val="Ttulo3"/>
-      </w:pPr>
-      <w:r>
-        <w:t>4.2. Ver experimentos</w:t>
-      </w:r>
+        <w:jc w:val="both"/>
+      </w:pPr>
+      <w:r>
+        <w:t xml:space="preserve">4.2. Ver </w:t>
+      </w:r>
+      <w:proofErr w:type="spellStart"/>
+      <w:r>
+        <w:t>experimentos</w:t>
+      </w:r>
+      <w:proofErr w:type="spellEnd"/>
     </w:p>
-    <w:p/>
     <w:p>
       <w:pPr>
         <w:pStyle w:val="Listaconvietas"/>
-      </w:pPr>
-      <w:r>
-        <w:t xml:space="preserve">Pulsa el botón </w:t>
-      </w:r>
+        <w:jc w:val="both"/>
+      </w:pPr>
+      <w:proofErr w:type="spellStart"/>
+      <w:r>
+        <w:t>Pulsa</w:t>
+      </w:r>
+      <w:proofErr w:type="spellEnd"/>
+      <w:r>
+        <w:t xml:space="preserve"> </w:t>
+      </w:r>
+      <w:proofErr w:type="spellStart"/>
+      <w:r>
+        <w:t>el</w:t>
+      </w:r>
+      <w:proofErr w:type="spellEnd"/>
+      <w:r>
+        <w:t xml:space="preserve"> </w:t>
+      </w:r>
+      <w:proofErr w:type="spellStart"/>
+      <w:r>
+        <w:t>botón</w:t>
+      </w:r>
+      <w:proofErr w:type="spellEnd"/>
+      <w:r>
+        <w:t xml:space="preserve"> </w:t>
+      </w:r>
+      <w:proofErr w:type="spellStart"/>
       <w:r>
         <w:rPr>
           <w:b/>
@@ -799,6 +1026,7 @@
         </w:rPr>
         <w:t>Experimentos</w:t>
       </w:r>
+      <w:proofErr w:type="spellEnd"/>
       <w:r>
         <w:t>.</w:t>
       </w:r>
@@ -806,6 +1034,7 @@
     <w:p>
       <w:pPr>
         <w:pStyle w:val="Listaconvietas"/>
+        <w:jc w:val="both"/>
         <w:rPr>
           <w:lang w:val="es-ES"/>
         </w:rPr>
@@ -820,6 +1049,7 @@
     <w:p>
       <w:pPr>
         <w:pStyle w:val="Listaconvietas"/>
+        <w:jc w:val="both"/>
         <w:rPr>
           <w:lang w:val="es-ES"/>
         </w:rPr>
@@ -834,6 +1064,7 @@
     <w:p>
       <w:pPr>
         <w:pStyle w:val="Listaconvietas"/>
+        <w:jc w:val="both"/>
         <w:rPr>
           <w:lang w:val="es-ES"/>
         </w:rPr>
@@ -847,6 +1078,7 @@
     </w:p>
     <w:p>
       <w:pPr>
+        <w:jc w:val="both"/>
         <w:rPr>
           <w:lang w:val="es-ES"/>
         </w:rPr>
@@ -856,6 +1088,7 @@
           <w:noProof/>
           <w:lang w:val="es-ES"/>
         </w:rPr>
+        <w:lastRenderedPageBreak/>
         <w:drawing>
           <wp:inline distT="0" distB="0" distL="0" distR="0" wp14:anchorId="429A395C" wp14:editId="58798B4E">
             <wp:extent cx="5486400" cy="2947670"/>
@@ -869,166 +1102,6 @@
                 <pic:pic xmlns:pic="http://schemas.openxmlformats.org/drawingml/2006/picture">
                   <pic:nvPicPr>
                     <pic:cNvPr id="1604398588" name="Imagen 1604398588"/>
-                    <pic:cNvPicPr/>
-                  </pic:nvPicPr>
-                  <pic:blipFill>
-                    <a:blip r:embed="rId9"/>
-                    <a:stretch>
-                      <a:fillRect/>
-                    </a:stretch>
-                  </pic:blipFill>
-                  <pic:spPr>
-                    <a:xfrm>
-                      <a:off x="0" y="0"/>
-                      <a:ext cx="5486400" cy="2947670"/>
-                    </a:xfrm>
-                    <a:prstGeom prst="rect">
-                      <a:avLst/>
-                    </a:prstGeom>
-                  </pic:spPr>
-                </pic:pic>
-              </a:graphicData>
-            </a:graphic>
-          </wp:inline>
-        </w:drawing>
-      </w:r>
-      <w:r>
-        <w:rPr>
-          <w:lang w:val="es-ES"/>
-        </w:rPr>
-        <w:t xml:space="preserve">[Imagen: Lista de experimentos] </w:t>
-      </w:r>
-    </w:p>
-    <w:p>
-      <w:pPr>
-        <w:rPr>
-          <w:lang w:val="es-ES"/>
-        </w:rPr>
-      </w:pPr>
-    </w:p>
-    <w:p>
-      <w:pPr>
-        <w:pStyle w:val="Ttulo3"/>
-        <w:rPr>
-          <w:lang w:val="es-ES"/>
-        </w:rPr>
-      </w:pPr>
-      <w:r>
-        <w:rPr>
-          <w:lang w:val="es-ES"/>
-        </w:rPr>
-        <w:t>4.3. Subir imágenes masivamente</w:t>
-      </w:r>
-    </w:p>
-    <w:p>
-      <w:pPr>
-        <w:rPr>
-          <w:lang w:val="es-ES"/>
-        </w:rPr>
-      </w:pPr>
-    </w:p>
-    <w:p>
-      <w:pPr>
-        <w:pStyle w:val="Listaconvietas"/>
-        <w:rPr>
-          <w:lang w:val="es-ES"/>
-        </w:rPr>
-      </w:pPr>
-      <w:r>
-        <w:rPr>
-          <w:lang w:val="es-ES"/>
-        </w:rPr>
-        <w:t xml:space="preserve">Pulsa el botón </w:t>
-      </w:r>
-      <w:r>
-        <w:rPr>
-          <w:b/>
-          <w:bCs/>
-          <w:lang w:val="es-ES"/>
-        </w:rPr>
-        <w:t>Subida masiva</w:t>
-      </w:r>
-      <w:r>
-        <w:rPr>
-          <w:lang w:val="es-ES"/>
-        </w:rPr>
-        <w:t>.</w:t>
-      </w:r>
-    </w:p>
-    <w:p>
-      <w:pPr>
-        <w:pStyle w:val="Listaconvietas"/>
-        <w:rPr>
-          <w:lang w:val="es-ES"/>
-        </w:rPr>
-      </w:pPr>
-      <w:r>
-        <w:rPr>
-          <w:lang w:val="es-ES"/>
-        </w:rPr>
-        <w:t>Sube un conjunto de imágenes.</w:t>
-      </w:r>
-    </w:p>
-    <w:p>
-      <w:pPr>
-        <w:pStyle w:val="Listaconvietas"/>
-      </w:pPr>
-      <w:r>
-        <w:t>Esta funcionalidad es delicada.</w:t>
-      </w:r>
-    </w:p>
-    <w:p>
-      <w:pPr>
-        <w:pStyle w:val="Listaconvietas"/>
-        <w:rPr>
-          <w:lang w:val="es-ES"/>
-        </w:rPr>
-      </w:pPr>
-      <w:r>
-        <w:rPr>
-          <w:lang w:val="es-ES"/>
-        </w:rPr>
-        <w:t xml:space="preserve">Se requiere rol de </w:t>
-      </w:r>
-      <w:r>
-        <w:rPr>
-          <w:b/>
-          <w:bCs/>
-          <w:lang w:val="es-ES"/>
-        </w:rPr>
-        <w:t>Usuario+</w:t>
-      </w:r>
-      <w:r>
-        <w:rPr>
-          <w:lang w:val="es-ES"/>
-        </w:rPr>
-        <w:t>.</w:t>
-      </w:r>
-    </w:p>
-    <w:p>
-      <w:pPr>
-        <w:rPr>
-          <w:lang w:val="es-ES"/>
-        </w:rPr>
-      </w:pPr>
-      <w:r>
-        <w:rPr>
-          <w:noProof/>
-          <w:lang w:val="es-ES"/>
-        </w:rPr>
-        <w:drawing>
-          <wp:inline distT="0" distB="0" distL="0" distR="0" wp14:anchorId="4D700D71" wp14:editId="3BA8D27E">
-            <wp:extent cx="5486400" cy="2947670"/>
-            <wp:effectExtent l="0" t="0" r="0" b="5080"/>
-            <wp:docPr id="1521900160" name="Imagen 6"/>
-            <wp:cNvGraphicFramePr>
-              <a:graphicFrameLocks xmlns:a="http://schemas.openxmlformats.org/drawingml/2006/main" noChangeAspect="1"/>
-            </wp:cNvGraphicFramePr>
-            <a:graphic xmlns:a="http://schemas.openxmlformats.org/drawingml/2006/main">
-              <a:graphicData uri="http://schemas.openxmlformats.org/drawingml/2006/picture">
-                <pic:pic xmlns:pic="http://schemas.openxmlformats.org/drawingml/2006/picture">
-                  <pic:nvPicPr>
-                    <pic:cNvPr id="1521900160" name="Imagen 1521900160"/>
                     <pic:cNvPicPr/>
                   </pic:nvPicPr>
                   <pic:blipFill>
@@ -1056,88 +1129,122 @@
         <w:rPr>
           <w:lang w:val="es-ES"/>
         </w:rPr>
-        <w:t xml:space="preserve">[Imagen: Pantalla de subida masiva] </w:t>
+        <w:t xml:space="preserve">[Imagen: Lista de experimentos] </w:t>
       </w:r>
     </w:p>
     <w:p>
       <w:pPr>
-        <w:rPr>
-          <w:lang w:val="es-ES"/>
-        </w:rPr>
-      </w:pPr>
-      <w:r>
-        <w:rPr>
-          <w:lang w:val="es-ES"/>
-        </w:rPr>
-        <w:t>----------------------------------------</w:t>
-      </w:r>
+        <w:jc w:val="both"/>
+        <w:rPr>
+          <w:lang w:val="es-ES"/>
+        </w:rPr>
+      </w:pPr>
     </w:p>
     <w:p>
       <w:pPr>
-        <w:rPr>
-          <w:lang w:val="es-ES"/>
-        </w:rPr>
-      </w:pPr>
+        <w:pStyle w:val="Ttulo3"/>
+        <w:jc w:val="both"/>
+        <w:rPr>
+          <w:lang w:val="es-ES"/>
+        </w:rPr>
+      </w:pPr>
+      <w:r>
+        <w:rPr>
+          <w:lang w:val="es-ES"/>
+        </w:rPr>
+        <w:t>4.3. Subir imágenes masivamente</w:t>
+      </w:r>
     </w:p>
     <w:p>
       <w:pPr>
-        <w:pStyle w:val="Ttulo2"/>
-        <w:rPr>
-          <w:lang w:val="es-ES"/>
-        </w:rPr>
-      </w:pPr>
-      <w:r>
-        <w:rPr>
-          <w:lang w:val="es-ES"/>
-        </w:rPr>
-        <w:t>5</w:t>
-      </w:r>
-      <w:r>
-        <w:rPr>
-          <w:lang w:val="es-ES"/>
-        </w:rPr>
-        <w:t>. Funciones principales para etiquetadores</w:t>
+        <w:pStyle w:val="Listaconvietas"/>
+        <w:jc w:val="both"/>
+        <w:rPr>
+          <w:lang w:val="es-ES"/>
+        </w:rPr>
+      </w:pPr>
+      <w:r>
+        <w:rPr>
+          <w:lang w:val="es-ES"/>
+        </w:rPr>
+        <w:t xml:space="preserve">Pulsa el botón </w:t>
+      </w:r>
+      <w:r>
+        <w:rPr>
+          <w:b/>
+          <w:bCs/>
+          <w:lang w:val="es-ES"/>
+        </w:rPr>
+        <w:t>Subida masiva</w:t>
+      </w:r>
+      <w:r>
+        <w:rPr>
+          <w:lang w:val="es-ES"/>
+        </w:rPr>
+        <w:t>.</w:t>
       </w:r>
     </w:p>
     <w:p>
       <w:pPr>
-        <w:pStyle w:val="Ttulo3"/>
-        <w:rPr>
-          <w:lang w:val="es-ES"/>
-        </w:rPr>
-      </w:pPr>
-      <w:r>
-        <w:rPr>
-          <w:lang w:val="es-ES"/>
-        </w:rPr>
-        <w:t>5</w:t>
-      </w:r>
-      <w:r>
-        <w:rPr>
-          <w:lang w:val="es-ES"/>
-        </w:rPr>
-        <w:t>.1. Etiquetar o validar imágenes</w:t>
+        <w:pStyle w:val="Listaconvietas"/>
+        <w:jc w:val="both"/>
+        <w:rPr>
+          <w:lang w:val="es-ES"/>
+        </w:rPr>
+      </w:pPr>
+      <w:r>
+        <w:rPr>
+          <w:lang w:val="es-ES"/>
+        </w:rPr>
+        <w:t>Sube un conjunto de imágenes</w:t>
+      </w:r>
+      <w:r>
+        <w:rPr>
+          <w:lang w:val="es-ES"/>
+        </w:rPr>
+        <w:t xml:space="preserve"> desde una carpeta con una estructura determinada.</w:t>
       </w:r>
     </w:p>
     <w:p>
       <w:pPr>
-        <w:rPr>
-          <w:lang w:val="es-ES"/>
-        </w:rPr>
-      </w:pPr>
+        <w:pStyle w:val="Listaconvietas"/>
+        <w:jc w:val="both"/>
+        <w:rPr>
+          <w:lang w:val="es-ES"/>
+        </w:rPr>
+      </w:pPr>
+      <w:r>
+        <w:rPr>
+          <w:lang w:val="es-ES"/>
+        </w:rPr>
+        <w:t>Esta funcionalidad es delicada</w:t>
+      </w:r>
+      <w:r>
+        <w:rPr>
+          <w:lang w:val="es-ES"/>
+        </w:rPr>
+        <w:t>, conta</w:t>
+      </w:r>
+      <w:r>
+        <w:rPr>
+          <w:lang w:val="es-ES"/>
+        </w:rPr>
+        <w:t>cta con el desarrollador antes de usarla.</w:t>
+      </w:r>
     </w:p>
     <w:p>
       <w:pPr>
         <w:pStyle w:val="Listaconvietas"/>
-        <w:rPr>
-          <w:lang w:val="es-ES"/>
-        </w:rPr>
-      </w:pPr>
-      <w:r>
-        <w:rPr>
-          <w:lang w:val="es-ES"/>
-        </w:rPr>
-        <w:t xml:space="preserve">Pulsa el botón </w:t>
+        <w:jc w:val="both"/>
+        <w:rPr>
+          <w:lang w:val="es-ES"/>
+        </w:rPr>
+      </w:pPr>
+      <w:r>
+        <w:rPr>
+          <w:lang w:val="es-ES"/>
+        </w:rPr>
+        <w:t xml:space="preserve">Se requiere rol de </w:t>
       </w:r>
       <w:r>
         <w:rPr>
@@ -1145,7 +1252,7 @@
           <w:bCs/>
           <w:lang w:val="es-ES"/>
         </w:rPr>
-        <w:t>Etiquetar/Validar</w:t>
+        <w:t>Usuario+</w:t>
       </w:r>
       <w:r>
         <w:rPr>
@@ -1156,74 +1263,246 @@
     </w:p>
     <w:p>
       <w:pPr>
-        <w:pStyle w:val="Listaconvietas"/>
-        <w:rPr>
-          <w:lang w:val="es-ES"/>
-        </w:rPr>
-      </w:pPr>
-      <w:r>
-        <w:rPr>
-          <w:lang w:val="es-ES"/>
-        </w:rPr>
-        <w:t>Filtra qué imágenes quieres comprobar.</w:t>
+        <w:jc w:val="both"/>
+        <w:rPr>
+          <w:lang w:val="es-ES"/>
+        </w:rPr>
+      </w:pPr>
+      <w:r>
+        <w:rPr>
+          <w:noProof/>
+          <w:lang w:val="es-ES"/>
+        </w:rPr>
+        <w:drawing>
+          <wp:inline distT="0" distB="0" distL="0" distR="0" wp14:anchorId="4D700D71" wp14:editId="3BA8D27E">
+            <wp:extent cx="5486400" cy="2947670"/>
+            <wp:effectExtent l="0" t="0" r="0" b="5080"/>
+            <wp:docPr id="1521900160" name="Imagen 6"/>
+            <wp:cNvGraphicFramePr>
+              <a:graphicFrameLocks xmlns:a="http://schemas.openxmlformats.org/drawingml/2006/main" noChangeAspect="1"/>
+            </wp:cNvGraphicFramePr>
+            <a:graphic xmlns:a="http://schemas.openxmlformats.org/drawingml/2006/main">
+              <a:graphicData uri="http://schemas.openxmlformats.org/drawingml/2006/picture">
+                <pic:pic xmlns:pic="http://schemas.openxmlformats.org/drawingml/2006/picture">
+                  <pic:nvPicPr>
+                    <pic:cNvPr id="1521900160" name="Imagen 1521900160"/>
+                    <pic:cNvPicPr/>
+                  </pic:nvPicPr>
+                  <pic:blipFill>
+                    <a:blip r:embed="rId11"/>
+                    <a:stretch>
+                      <a:fillRect/>
+                    </a:stretch>
+                  </pic:blipFill>
+                  <pic:spPr>
+                    <a:xfrm>
+                      <a:off x="0" y="0"/>
+                      <a:ext cx="5486400" cy="2947670"/>
+                    </a:xfrm>
+                    <a:prstGeom prst="rect">
+                      <a:avLst/>
+                    </a:prstGeom>
+                  </pic:spPr>
+                </pic:pic>
+              </a:graphicData>
+            </a:graphic>
+          </wp:inline>
+        </w:drawing>
+      </w:r>
+      <w:r>
+        <w:rPr>
+          <w:lang w:val="es-ES"/>
+        </w:rPr>
+        <w:t xml:space="preserve">[Imagen: Pantalla de subida masiva] </w:t>
       </w:r>
     </w:p>
     <w:p>
       <w:pPr>
-        <w:pStyle w:val="Listaconvietas"/>
-        <w:rPr>
-          <w:lang w:val="es-ES"/>
-        </w:rPr>
-      </w:pPr>
-      <w:r>
-        <w:rPr>
-          <w:lang w:val="es-ES"/>
-        </w:rPr>
-        <w:t>Selecciona una imagen de la lista.</w:t>
-      </w:r>
+        <w:jc w:val="both"/>
+        <w:rPr>
+          <w:lang w:val="es-ES"/>
+        </w:rPr>
+      </w:pPr>
     </w:p>
     <w:p>
       <w:pPr>
-        <w:pStyle w:val="Listaconvietas"/>
-      </w:pPr>
-      <w:r>
-        <w:t>Selecciona la etiqueta.</w:t>
+        <w:pStyle w:val="Ttulo2"/>
+        <w:jc w:val="both"/>
+        <w:rPr>
+          <w:lang w:val="es-ES"/>
+        </w:rPr>
+      </w:pPr>
+      <w:r>
+        <w:rPr>
+          <w:lang w:val="es-ES"/>
+        </w:rPr>
+        <w:lastRenderedPageBreak/>
+        <w:t>5</w:t>
+      </w:r>
+      <w:r>
+        <w:rPr>
+          <w:lang w:val="es-ES"/>
+        </w:rPr>
+        <w:t>. Funciones principales para etiquetadores</w:t>
       </w:r>
     </w:p>
     <w:p>
       <w:pPr>
+        <w:pStyle w:val="Ttulo3"/>
+        <w:jc w:val="both"/>
+        <w:rPr>
+          <w:lang w:val="es-ES"/>
+        </w:rPr>
+      </w:pPr>
+      <w:r>
+        <w:rPr>
+          <w:lang w:val="es-ES"/>
+        </w:rPr>
+        <w:t>5</w:t>
+      </w:r>
+      <w:r>
+        <w:rPr>
+          <w:lang w:val="es-ES"/>
+        </w:rPr>
+        <w:t>.1. Etiquetar o validar imágenes</w:t>
+      </w:r>
+    </w:p>
+    <w:p>
+      <w:pPr>
         <w:pStyle w:val="Listaconvietas"/>
-      </w:pPr>
-      <w:r>
-        <w:t xml:space="preserve">Haz clic en </w:t>
+        <w:jc w:val="both"/>
+        <w:rPr>
+          <w:lang w:val="es-ES"/>
+        </w:rPr>
+      </w:pPr>
+      <w:r>
+        <w:rPr>
+          <w:lang w:val="es-ES"/>
+        </w:rPr>
+        <w:t xml:space="preserve">Pulsa el botón </w:t>
       </w:r>
       <w:r>
         <w:rPr>
           <w:b/>
           <w:bCs/>
-        </w:rPr>
-        <w:t>Etiquetar</w:t>
-      </w:r>
-      <w:r>
+          <w:lang w:val="es-ES"/>
+        </w:rPr>
+        <w:t>Etiquetar/Validar</w:t>
+      </w:r>
+      <w:r>
+        <w:rPr>
+          <w:lang w:val="es-ES"/>
+        </w:rPr>
         <w:t>.</w:t>
       </w:r>
     </w:p>
     <w:p>
       <w:pPr>
         <w:pStyle w:val="Listaconvietas"/>
-        <w:rPr>
-          <w:lang w:val="es-ES"/>
-        </w:rPr>
-      </w:pPr>
-      <w:r>
-        <w:rPr>
-          <w:lang w:val="es-ES"/>
-        </w:rPr>
-        <w:t>Valida si estás seguro/a de que la etiqueta es correcta.</w:t>
+        <w:jc w:val="both"/>
+        <w:rPr>
+          <w:lang w:val="es-ES"/>
+        </w:rPr>
+      </w:pPr>
+      <w:r>
+        <w:rPr>
+          <w:lang w:val="es-ES"/>
+        </w:rPr>
+        <w:t>Filtra qué imágenes quieres comprobar.</w:t>
       </w:r>
     </w:p>
     <w:p>
       <w:pPr>
+        <w:pStyle w:val="Listaconvietas"/>
+        <w:jc w:val="both"/>
+        <w:rPr>
+          <w:lang w:val="es-ES"/>
+        </w:rPr>
+      </w:pPr>
+      <w:r>
+        <w:rPr>
+          <w:lang w:val="es-ES"/>
+        </w:rPr>
+        <w:t>Selecciona una imagen de la lista.</w:t>
+      </w:r>
+    </w:p>
+    <w:p>
+      <w:pPr>
+        <w:pStyle w:val="Listaconvietas"/>
+        <w:jc w:val="both"/>
+      </w:pPr>
+      <w:proofErr w:type="spellStart"/>
+      <w:r>
+        <w:t>Selecciona</w:t>
+      </w:r>
+      <w:proofErr w:type="spellEnd"/>
+      <w:r>
+        <w:t xml:space="preserve"> la </w:t>
+      </w:r>
+      <w:proofErr w:type="spellStart"/>
+      <w:r>
+        <w:t>etiqueta</w:t>
+      </w:r>
+      <w:proofErr w:type="spellEnd"/>
+      <w:r>
+        <w:t>.</w:t>
+      </w:r>
+    </w:p>
+    <w:p>
+      <w:pPr>
+        <w:pStyle w:val="Listaconvietas"/>
+        <w:jc w:val="both"/>
+      </w:pPr>
+      <w:r>
+        <w:t xml:space="preserve">Haz </w:t>
+      </w:r>
+      <w:proofErr w:type="spellStart"/>
+      <w:r>
+        <w:t>clic</w:t>
+      </w:r>
+      <w:proofErr w:type="spellEnd"/>
+      <w:r>
+        <w:t xml:space="preserve"> </w:t>
+      </w:r>
+      <w:proofErr w:type="spellStart"/>
+      <w:r>
+        <w:t>en</w:t>
+      </w:r>
+      <w:proofErr w:type="spellEnd"/>
+      <w:r>
+        <w:t xml:space="preserve"> </w:t>
+      </w:r>
+      <w:proofErr w:type="spellStart"/>
+      <w:r>
+        <w:rPr>
+          <w:b/>
+          <w:bCs/>
+        </w:rPr>
+        <w:t>Etiquetar</w:t>
+      </w:r>
+      <w:proofErr w:type="spellEnd"/>
+      <w:r>
+        <w:t>.</w:t>
+      </w:r>
+    </w:p>
+    <w:p>
+      <w:pPr>
+        <w:pStyle w:val="Listaconvietas"/>
+        <w:jc w:val="both"/>
+        <w:rPr>
+          <w:lang w:val="es-ES"/>
+        </w:rPr>
+      </w:pPr>
+      <w:r>
+        <w:rPr>
+          <w:lang w:val="es-ES"/>
+        </w:rPr>
+        <w:t>Valida si estás seguro/a de que la etiqueta es correcta.</w:t>
+      </w:r>
+    </w:p>
+    <w:p>
+      <w:pPr>
+        <w:jc w:val="both"/>
         <w:rPr>
           <w:lang w:val="es-ES"/>
         </w:rPr>
@@ -1233,7 +1512,6 @@
           <w:noProof/>
           <w:lang w:val="es-ES"/>
         </w:rPr>
-        <w:lastRenderedPageBreak/>
         <w:drawing>
           <wp:inline distT="0" distB="0" distL="0" distR="0" wp14:anchorId="0CECD18F" wp14:editId="059A4471">
             <wp:extent cx="5486400" cy="2960370"/>
@@ -1250,7 +1528,7 @@
                     <pic:cNvPicPr/>
                   </pic:nvPicPr>
                   <pic:blipFill>
-                    <a:blip r:embed="rId11"/>
+                    <a:blip r:embed="rId12"/>
                     <a:stretch>
                       <a:fillRect/>
                     </a:stretch>
@@ -1279,6 +1557,7 @@
     </w:p>
     <w:p>
       <w:pPr>
+        <w:jc w:val="both"/>
         <w:rPr>
           <w:lang w:val="es-ES"/>
         </w:rPr>
@@ -1287,18 +1566,29 @@
     <w:p>
       <w:pPr>
         <w:pStyle w:val="Ttulo3"/>
-      </w:pPr>
-      <w:r>
-        <w:t>5</w:t>
-      </w:r>
-      <w:r>
-        <w:t>.2. Editar clases</w:t>
-      </w:r>
+        <w:jc w:val="both"/>
+      </w:pPr>
+      <w:r>
+        <w:t xml:space="preserve">5.2. </w:t>
+      </w:r>
+      <w:proofErr w:type="spellStart"/>
+      <w:r>
+        <w:t>Editar</w:t>
+      </w:r>
+      <w:proofErr w:type="spellEnd"/>
+      <w:r>
+        <w:t xml:space="preserve"> </w:t>
+      </w:r>
+      <w:proofErr w:type="spellStart"/>
+      <w:r>
+        <w:t>clases</w:t>
+      </w:r>
+      <w:proofErr w:type="spellEnd"/>
     </w:p>
-    <w:p/>
     <w:p>
       <w:pPr>
         <w:pStyle w:val="Listaconvietas"/>
+        <w:jc w:val="both"/>
         <w:rPr>
           <w:lang w:val="es-ES"/>
         </w:rPr>
@@ -1327,6 +1617,7 @@
     <w:p>
       <w:pPr>
         <w:pStyle w:val="Listaconvietas"/>
+        <w:jc w:val="both"/>
         <w:rPr>
           <w:lang w:val="es-ES"/>
         </w:rPr>
@@ -1341,6 +1632,7 @@
     <w:p>
       <w:pPr>
         <w:pStyle w:val="Listaconvietas"/>
+        <w:jc w:val="both"/>
         <w:rPr>
           <w:lang w:val="es-ES"/>
         </w:rPr>
@@ -1355,14 +1647,32 @@
     <w:p>
       <w:pPr>
         <w:pStyle w:val="Listaconvietas"/>
-      </w:pPr>
-      <w:r>
-        <w:t>Guarda los cambios.</w:t>
+        <w:jc w:val="both"/>
+      </w:pPr>
+      <w:r>
+        <w:t xml:space="preserve">Guarda </w:t>
+      </w:r>
+      <w:proofErr w:type="spellStart"/>
+      <w:r>
+        <w:t>los</w:t>
+      </w:r>
+      <w:proofErr w:type="spellEnd"/>
+      <w:r>
+        <w:t xml:space="preserve"> </w:t>
+      </w:r>
+      <w:proofErr w:type="spellStart"/>
+      <w:r>
+        <w:t>cambios</w:t>
+      </w:r>
+      <w:proofErr w:type="spellEnd"/>
+      <w:r>
+        <w:t>.</w:t>
       </w:r>
     </w:p>
     <w:p>
       <w:pPr>
         <w:pStyle w:val="Listaconvietas"/>
+        <w:jc w:val="both"/>
         <w:rPr>
           <w:lang w:val="es-ES"/>
         </w:rPr>
@@ -1377,6 +1687,7 @@
     <w:p>
       <w:pPr>
         <w:pStyle w:val="Listaconvietas"/>
+        <w:jc w:val="both"/>
         <w:rPr>
           <w:lang w:val="es-ES"/>
         </w:rPr>
@@ -1390,6 +1701,7 @@
     </w:p>
     <w:p>
       <w:pPr>
+        <w:jc w:val="both"/>
         <w:rPr>
           <w:lang w:val="es-ES"/>
         </w:rPr>
@@ -1401,9 +1713,9 @@
         </w:rPr>
         <w:lastRenderedPageBreak/>
         <w:drawing>
-          <wp:inline distT="0" distB="0" distL="0" distR="0" wp14:anchorId="74F3D57E" wp14:editId="52AD57A6">
-            <wp:extent cx="5486400" cy="2948305"/>
-            <wp:effectExtent l="0" t="0" r="0" b="4445"/>
+          <wp:inline distT="0" distB="0" distL="0" distR="0" wp14:anchorId="74F3D57E" wp14:editId="5799EA1D">
+            <wp:extent cx="5390515" cy="2896777"/>
+            <wp:effectExtent l="0" t="0" r="635" b="0"/>
             <wp:docPr id="678188421" name="Imagen 8"/>
             <wp:cNvGraphicFramePr>
               <a:graphicFrameLocks xmlns:a="http://schemas.openxmlformats.org/drawingml/2006/main" noChangeAspect="1"/>
@@ -1416,7 +1728,7 @@
                     <pic:cNvPicPr/>
                   </pic:nvPicPr>
                   <pic:blipFill>
-                    <a:blip r:embed="rId12"/>
+                    <a:blip r:embed="rId13"/>
                     <a:stretch>
                       <a:fillRect/>
                     </a:stretch>
@@ -1424,7 +1736,7 @@
                   <pic:spPr>
                     <a:xfrm>
                       <a:off x="0" y="0"/>
-                      <a:ext cx="5486400" cy="2948305"/>
+                      <a:ext cx="5419375" cy="2912286"/>
                     </a:xfrm>
                     <a:prstGeom prst="rect">
                       <a:avLst/>
@@ -1445,39 +1757,68 @@
     </w:p>
     <w:p>
       <w:pPr>
+        <w:jc w:val="both"/>
         <w:rPr>
           <w:lang w:val="es-ES"/>
         </w:rPr>
       </w:pPr>
     </w:p>
     <w:p>
-      <w:r>
-        <w:t>----------------------------------------</w:t>
-      </w:r>
+      <w:pPr>
+        <w:pStyle w:val="Ttulo2"/>
+        <w:jc w:val="both"/>
+      </w:pPr>
+      <w:r>
+        <w:t xml:space="preserve">6. </w:t>
+      </w:r>
+      <w:proofErr w:type="spellStart"/>
+      <w:r>
+        <w:t>Funciones</w:t>
+      </w:r>
+      <w:proofErr w:type="spellEnd"/>
+      <w:r>
+        <w:t xml:space="preserve"> </w:t>
+      </w:r>
+      <w:proofErr w:type="spellStart"/>
+      <w:r>
+        <w:t>principales</w:t>
+      </w:r>
+      <w:proofErr w:type="spellEnd"/>
+      <w:r>
+        <w:t xml:space="preserve"> para </w:t>
+      </w:r>
+      <w:proofErr w:type="spellStart"/>
+      <w:r>
+        <w:t>administradores</w:t>
+      </w:r>
+      <w:proofErr w:type="spellEnd"/>
     </w:p>
     <w:p>
       <w:pPr>
-        <w:pStyle w:val="Ttulo2"/>
-      </w:pPr>
-      <w:r>
-        <w:t>6</w:t>
-      </w:r>
-      <w:r>
-        <w:t>. Funciones principales para administradores</w:t>
-      </w:r>
-    </w:p>
-    <w:p/>
-    <w:p>
-      <w:pPr>
         <w:pStyle w:val="Listaconvietas"/>
-      </w:pPr>
-      <w:r>
-        <w:t>Gestión de usuarios.</w:t>
+        <w:jc w:val="both"/>
+      </w:pPr>
+      <w:proofErr w:type="spellStart"/>
+      <w:r>
+        <w:t>Gestión</w:t>
+      </w:r>
+      <w:proofErr w:type="spellEnd"/>
+      <w:r>
+        <w:t xml:space="preserve"> de </w:t>
+      </w:r>
+      <w:proofErr w:type="spellStart"/>
+      <w:r>
+        <w:t>usuarios</w:t>
+      </w:r>
+      <w:proofErr w:type="spellEnd"/>
+      <w:r>
+        <w:t>.</w:t>
       </w:r>
     </w:p>
     <w:p>
       <w:pPr>
         <w:pStyle w:val="Listaconvietas"/>
+        <w:jc w:val="both"/>
         <w:rPr>
           <w:lang w:val="es-ES"/>
         </w:rPr>
@@ -1491,6 +1832,7 @@
     </w:p>
     <w:p>
       <w:pPr>
+        <w:jc w:val="both"/>
         <w:rPr>
           <w:lang w:val="es-ES"/>
         </w:rPr>
@@ -1501,9 +1843,9 @@
           <w:lang w:val="es-ES"/>
         </w:rPr>
         <w:drawing>
-          <wp:inline distT="0" distB="0" distL="0" distR="0" wp14:anchorId="727A6BF1" wp14:editId="58FC56B2">
-            <wp:extent cx="5486400" cy="2962275"/>
-            <wp:effectExtent l="0" t="0" r="0" b="9525"/>
+          <wp:inline distT="0" distB="0" distL="0" distR="0" wp14:anchorId="727A6BF1" wp14:editId="2AE2D099">
+            <wp:extent cx="5391138" cy="2910840"/>
+            <wp:effectExtent l="0" t="0" r="635" b="3810"/>
             <wp:docPr id="1760438032" name="Imagen 9"/>
             <wp:cNvGraphicFramePr>
               <a:graphicFrameLocks xmlns:a="http://schemas.openxmlformats.org/drawingml/2006/main" noChangeAspect="1"/>
@@ -1516,7 +1858,7 @@
                     <pic:cNvPicPr/>
                   </pic:nvPicPr>
                   <pic:blipFill>
-                    <a:blip r:embed="rId13"/>
+                    <a:blip r:embed="rId14"/>
                     <a:stretch>
                       <a:fillRect/>
                     </a:stretch>
@@ -1524,7 +1866,7 @@
                   <pic:spPr>
                     <a:xfrm>
                       <a:off x="0" y="0"/>
-                      <a:ext cx="5486400" cy="2962275"/>
+                      <a:ext cx="5403403" cy="2917462"/>
                     </a:xfrm>
                     <a:prstGeom prst="rect">
                       <a:avLst/>
@@ -1551,54 +1893,28 @@
     </w:p>
     <w:p>
       <w:pPr>
-        <w:rPr>
-          <w:lang w:val="es-ES"/>
-        </w:rPr>
-      </w:pPr>
-      <w:r>
-        <w:rPr>
-          <w:lang w:val="es-ES"/>
-        </w:rPr>
-        <w:lastRenderedPageBreak/>
-        <w:t>----------------------------------------</w:t>
+        <w:pStyle w:val="Ttulo2"/>
+        <w:jc w:val="both"/>
+        <w:rPr>
+          <w:lang w:val="es-ES"/>
+        </w:rPr>
+      </w:pPr>
+      <w:r>
+        <w:rPr>
+          <w:lang w:val="es-ES"/>
+        </w:rPr>
+        <w:t>7</w:t>
+      </w:r>
+      <w:r>
+        <w:rPr>
+          <w:lang w:val="es-ES"/>
+        </w:rPr>
+        <w:t>. Soporte</w:t>
       </w:r>
     </w:p>
     <w:p>
       <w:pPr>
-        <w:rPr>
-          <w:lang w:val="es-ES"/>
-        </w:rPr>
-      </w:pPr>
-    </w:p>
-    <w:p>
-      <w:pPr>
-        <w:pStyle w:val="Ttulo2"/>
-        <w:rPr>
-          <w:lang w:val="es-ES"/>
-        </w:rPr>
-      </w:pPr>
-      <w:r>
-        <w:rPr>
-          <w:lang w:val="es-ES"/>
-        </w:rPr>
-        <w:t>7</w:t>
-      </w:r>
-      <w:r>
-        <w:rPr>
-          <w:lang w:val="es-ES"/>
-        </w:rPr>
-        <w:t>. Soporte</w:t>
-      </w:r>
-    </w:p>
-    <w:p>
-      <w:pPr>
-        <w:rPr>
-          <w:lang w:val="es-ES"/>
-        </w:rPr>
-      </w:pPr>
-    </w:p>
-    <w:p>
-      <w:pPr>
+        <w:jc w:val="both"/>
         <w:rPr>
           <w:lang w:val="es-ES"/>
         </w:rPr>
@@ -1609,13 +1925,6 @@
         </w:rPr>
         <w:t>Si tienes problemas o preguntas, contacta con: pralfes@etsinf.upv.es</w:t>
       </w:r>
-    </w:p>
-    <w:p>
-      <w:pPr>
-        <w:rPr>
-          <w:lang w:val="es-ES"/>
-        </w:rPr>
-      </w:pPr>
     </w:p>
     <w:sectPr>
       <w:pgSz w:w="12240" w:h="15840"/>
@@ -13210,6 +13519,41 @@
       </w:tcPr>
     </w:tblStylePr>
   </w:style>
+  <w:style w:type="character" w:styleId="Hipervnculo">
+    <w:name w:val="Hyperlink"/>
+    <w:basedOn w:val="Fuentedeprrafopredeter"/>
+    <w:uiPriority w:val="99"/>
+    <w:unhideWhenUsed/>
+    <w:rsid w:val="00D94A9D"/>
+    <w:rPr>
+      <w:color w:val="0000FF" w:themeColor="hyperlink"/>
+      <w:u w:val="single"/>
+    </w:rPr>
+  </w:style>
+  <w:style w:type="character" w:styleId="Mencinsinresolver">
+    <w:name w:val="Unresolved Mention"/>
+    <w:basedOn w:val="Fuentedeprrafopredeter"/>
+    <w:uiPriority w:val="99"/>
+    <w:semiHidden/>
+    <w:unhideWhenUsed/>
+    <w:rsid w:val="00D94A9D"/>
+    <w:rPr>
+      <w:color w:val="605E5C"/>
+      <w:shd w:val="clear" w:color="auto" w:fill="E1DFDD"/>
+    </w:rPr>
+  </w:style>
+  <w:style w:type="character" w:styleId="Hipervnculovisitado">
+    <w:name w:val="FollowedHyperlink"/>
+    <w:basedOn w:val="Fuentedeprrafopredeter"/>
+    <w:uiPriority w:val="99"/>
+    <w:semiHidden/>
+    <w:unhideWhenUsed/>
+    <w:rsid w:val="00D94A9D"/>
+    <w:rPr>
+      <w:color w:val="800080" w:themeColor="followedHyperlink"/>
+      <w:u w:val="single"/>
+    </w:rPr>
+  </w:style>
 </w:styles>
 </file>
 

</xml_diff>